<commit_message>
cambiar estados de pago_mensual
</commit_message>
<xml_diff>
--- a/cambios_DER.docx
+++ b/cambios_DER.docx
@@ -121,8 +121,6 @@
         </w:rPr>
         <w:t xml:space="preserve"> a tipo actividad</w:t>
       </w:r>
-      <w:bookmarkStart w:id="0" w:name="_GoBack"/>
-      <w:bookmarkEnd w:id="0"/>
       <w:r>
         <w:rPr>
           <w:lang w:val="es-AR"/>
@@ -172,8 +170,109 @@
         </w:drawing>
       </w:r>
     </w:p>
-    <w:p/>
-    <w:p/>
+    <w:p>
+      <w:pPr>
+        <w:rPr>
+          <w:lang w:val="es-AR"/>
+        </w:rPr>
+      </w:pPr>
+      <w:r>
+        <w:rPr>
+          <w:lang w:val="es-AR"/>
+        </w:rPr>
+        <w:t>Se saco el atributo estado de pago mensual</w:t>
+      </w:r>
+      <w:r>
+        <w:rPr>
+          <w:lang w:val="es-AR"/>
+        </w:rPr>
+        <w:t xml:space="preserve"> y de concesion</w:t>
+      </w:r>
+      <w:bookmarkStart w:id="0" w:name="_GoBack"/>
+      <w:bookmarkEnd w:id="0"/>
+    </w:p>
+    <w:p>
+      <w:r>
+        <w:rPr>
+          <w:noProof/>
+        </w:rPr>
+        <w:drawing>
+          <wp:inline distT="0" distB="0" distL="0" distR="0" wp14:anchorId="4BE4582E" wp14:editId="379EBE15">
+            <wp:extent cx="3019425" cy="1933575"/>
+            <wp:effectExtent l="0" t="0" r="9525" b="9525"/>
+            <wp:docPr id="3" name="Imagen 3"/>
+            <wp:cNvGraphicFramePr>
+              <a:graphicFrameLocks xmlns:a="http://schemas.openxmlformats.org/drawingml/2006/main" noChangeAspect="1"/>
+            </wp:cNvGraphicFramePr>
+            <a:graphic xmlns:a="http://schemas.openxmlformats.org/drawingml/2006/main">
+              <a:graphicData uri="http://schemas.openxmlformats.org/drawingml/2006/picture">
+                <pic:pic xmlns:pic="http://schemas.openxmlformats.org/drawingml/2006/picture">
+                  <pic:nvPicPr>
+                    <pic:cNvPr id="1" name=""/>
+                    <pic:cNvPicPr/>
+                  </pic:nvPicPr>
+                  <pic:blipFill>
+                    <a:blip r:embed="rId7"/>
+                    <a:stretch>
+                      <a:fillRect/>
+                    </a:stretch>
+                  </pic:blipFill>
+                  <pic:spPr>
+                    <a:xfrm>
+                      <a:off x="0" y="0"/>
+                      <a:ext cx="3019425" cy="1933575"/>
+                    </a:xfrm>
+                    <a:prstGeom prst="rect">
+                      <a:avLst/>
+                    </a:prstGeom>
+                  </pic:spPr>
+                </pic:pic>
+              </a:graphicData>
+            </a:graphic>
+          </wp:inline>
+        </w:drawing>
+      </w:r>
+      <w:r>
+        <w:rPr>
+          <w:noProof/>
+        </w:rPr>
+        <w:drawing>
+          <wp:inline distT="0" distB="0" distL="0" distR="0" wp14:anchorId="4A0440B7" wp14:editId="55F026D3">
+            <wp:extent cx="2390775" cy="1714500"/>
+            <wp:effectExtent l="0" t="0" r="9525" b="0"/>
+            <wp:docPr id="5" name="Imagen 5"/>
+            <wp:cNvGraphicFramePr>
+              <a:graphicFrameLocks xmlns:a="http://schemas.openxmlformats.org/drawingml/2006/main" noChangeAspect="1"/>
+            </wp:cNvGraphicFramePr>
+            <a:graphic xmlns:a="http://schemas.openxmlformats.org/drawingml/2006/main">
+              <a:graphicData uri="http://schemas.openxmlformats.org/drawingml/2006/picture">
+                <pic:pic xmlns:pic="http://schemas.openxmlformats.org/drawingml/2006/picture">
+                  <pic:nvPicPr>
+                    <pic:cNvPr id="1" name=""/>
+                    <pic:cNvPicPr/>
+                  </pic:nvPicPr>
+                  <pic:blipFill>
+                    <a:blip r:embed="rId8"/>
+                    <a:stretch>
+                      <a:fillRect/>
+                    </a:stretch>
+                  </pic:blipFill>
+                  <pic:spPr>
+                    <a:xfrm>
+                      <a:off x="0" y="0"/>
+                      <a:ext cx="2390775" cy="1714500"/>
+                    </a:xfrm>
+                    <a:prstGeom prst="rect">
+                      <a:avLst/>
+                    </a:prstGeom>
+                  </pic:spPr>
+                </pic:pic>
+              </a:graphicData>
+            </a:graphic>
+          </wp:inline>
+        </w:drawing>
+      </w:r>
+    </w:p>
     <w:sectPr>
       <w:pgSz w:w="12240" w:h="15840"/>
       <w:pgMar w:top="1440" w:right="1440" w:bottom="1440" w:left="1440" w:header="720" w:footer="720" w:gutter="0"/>

</xml_diff>

<commit_message>
cambios para borrado logico
</commit_message>
<xml_diff>
--- a/cambios_DER.docx
+++ b/cambios_DER.docx
@@ -188,8 +188,6 @@
         </w:rPr>
         <w:t xml:space="preserve"> y de concesion</w:t>
       </w:r>
-      <w:bookmarkStart w:id="0" w:name="_GoBack"/>
-      <w:bookmarkEnd w:id="0"/>
     </w:p>
     <w:p>
       <w:r>
@@ -272,6 +270,21 @@
           </wp:inline>
         </w:drawing>
       </w:r>
+    </w:p>
+    <w:p>
+      <w:pPr>
+        <w:rPr>
+          <w:lang w:val="es-AR"/>
+        </w:rPr>
+      </w:pPr>
+      <w:r>
+        <w:rPr>
+          <w:lang w:val="es-AR"/>
+        </w:rPr>
+        <w:t>Se agrego el atributo Estado a todos los que no lo tenian para poder hacer un borrado logico</w:t>
+      </w:r>
+      <w:bookmarkStart w:id="0" w:name="_GoBack"/>
+      <w:bookmarkEnd w:id="0"/>
     </w:p>
     <w:sectPr>
       <w:pgSz w:w="12240" w:h="15840"/>

</xml_diff>

<commit_message>
modificar para poder agregar relacion tour-parque
</commit_message>
<xml_diff>
--- a/cambios_DER.docx
+++ b/cambios_DER.docx
@@ -282,6 +282,74 @@
           <w:lang w:val="es-AR"/>
         </w:rPr>
         <w:t>Se agrego el atributo Estado a todos los que no lo tenian para poder hacer un borrado logico</w:t>
+      </w:r>
+    </w:p>
+    <w:p>
+      <w:pPr>
+        <w:rPr>
+          <w:lang w:val="es-AR"/>
+        </w:rPr>
+      </w:pPr>
+    </w:p>
+    <w:p>
+      <w:pPr>
+        <w:rPr>
+          <w:lang w:val="es-AR"/>
+        </w:rPr>
+      </w:pPr>
+      <w:r>
+        <w:rPr>
+          <w:lang w:val="es-AR"/>
+        </w:rPr>
+        <w:lastRenderedPageBreak/>
+        <w:t>Se la relacion parque-tour para poder ver a que parque pertenece cuando no hay un guia asignado</w:t>
+      </w:r>
+    </w:p>
+    <w:p>
+      <w:pPr>
+        <w:rPr>
+          <w:lang w:val="es-AR"/>
+        </w:rPr>
+      </w:pPr>
+      <w:r>
+        <w:rPr>
+          <w:noProof/>
+        </w:rPr>
+        <w:drawing>
+          <wp:inline distT="0" distB="0" distL="0" distR="0" wp14:anchorId="6EDC2902" wp14:editId="580CA8C2">
+            <wp:extent cx="1343025" cy="1362075"/>
+            <wp:effectExtent l="0" t="0" r="9525" b="9525"/>
+            <wp:docPr id="6" name="Imagen 6"/>
+            <wp:cNvGraphicFramePr>
+              <a:graphicFrameLocks xmlns:a="http://schemas.openxmlformats.org/drawingml/2006/main" noChangeAspect="1"/>
+            </wp:cNvGraphicFramePr>
+            <a:graphic xmlns:a="http://schemas.openxmlformats.org/drawingml/2006/main">
+              <a:graphicData uri="http://schemas.openxmlformats.org/drawingml/2006/picture">
+                <pic:pic xmlns:pic="http://schemas.openxmlformats.org/drawingml/2006/picture">
+                  <pic:nvPicPr>
+                    <pic:cNvPr id="1" name=""/>
+                    <pic:cNvPicPr/>
+                  </pic:nvPicPr>
+                  <pic:blipFill>
+                    <a:blip r:embed="rId9"/>
+                    <a:stretch>
+                      <a:fillRect/>
+                    </a:stretch>
+                  </pic:blipFill>
+                  <pic:spPr>
+                    <a:xfrm>
+                      <a:off x="0" y="0"/>
+                      <a:ext cx="1343025" cy="1362075"/>
+                    </a:xfrm>
+                    <a:prstGeom prst="rect">
+                      <a:avLst/>
+                    </a:prstGeom>
+                  </pic:spPr>
+                </pic:pic>
+              </a:graphicData>
+            </a:graphic>
+          </wp:inline>
+        </w:drawing>
       </w:r>
       <w:bookmarkStart w:id="0" w:name="_GoBack"/>
       <w:bookmarkEnd w:id="0"/>

</xml_diff>